<commit_message>
API: API POST error gemaakt.
</commit_message>
<xml_diff>
--- a/Documentatie/4. programmeren en onderzoek/Onderzoek over API POST.docx
+++ b/Documentatie/4. programmeren en onderzoek/Onderzoek over API POST.docx
@@ -566,7 +566,13 @@
     <w:sdt>
       <w:sdtPr>
         <w:rPr>
-          <w:lang w:val="nl-NL"/>
+          <w:rFonts w:asciiTheme="minorHAnsi" w:eastAsiaTheme="minorHAnsi" w:hAnsiTheme="minorHAnsi" w:cstheme="minorBidi"/>
+          <w:color w:val="auto"/>
+          <w:kern w:val="2"/>
+          <w:sz w:val="22"/>
+          <w:szCs w:val="22"/>
+          <w:lang w:val="nl-NL" w:eastAsia="en-US"/>
+          <w14:ligatures w14:val="standardContextual"/>
         </w:rPr>
         <w:id w:val="-1074041952"/>
         <w:docPartObj>
@@ -576,15 +582,8 @@
       </w:sdtPr>
       <w:sdtEndPr>
         <w:rPr>
-          <w:rFonts w:asciiTheme="minorHAnsi" w:eastAsiaTheme="minorHAnsi" w:hAnsiTheme="minorHAnsi" w:cstheme="minorBidi"/>
           <w:b/>
           <w:bCs/>
-          <w:color w:val="auto"/>
-          <w:kern w:val="2"/>
-          <w:sz w:val="22"/>
-          <w:szCs w:val="22"/>
-          <w:lang w:eastAsia="en-US"/>
-          <w14:ligatures w14:val="standardContextual"/>
         </w:rPr>
       </w:sdtEndPr>
       <w:sdtContent>
@@ -600,17 +599,169 @@
           </w:r>
         </w:p>
         <w:p>
-          <w:fldSimple w:instr=" TOC \o &quot;1-3&quot; \h \z \u ">
+          <w:pPr>
+            <w:pStyle w:val="Inhopg1"/>
+            <w:tabs>
+              <w:tab w:val="right" w:leader="dot" w:pos="9016"/>
+            </w:tabs>
+            <w:rPr>
+              <w:rFonts w:eastAsiaTheme="minorEastAsia"/>
+              <w:noProof/>
+              <w:sz w:val="24"/>
+              <w:szCs w:val="24"/>
+              <w:lang w:val="nl-NL" w:eastAsia="nl-NL"/>
+            </w:rPr>
+          </w:pPr>
+          <w:r>
+            <w:fldChar w:fldCharType="begin"/>
+          </w:r>
+          <w:r>
+            <w:instrText xml:space="preserve"> TOC \o "1-3" \h \z \u </w:instrText>
+          </w:r>
+          <w:r>
+            <w:fldChar w:fldCharType="separate"/>
+          </w:r>
+          <w:hyperlink w:anchor="_Toc227086851" w:history="1">
             <w:r>
               <w:rPr>
-                <w:b/>
-                <w:bCs/>
+                <w:rStyle w:val="Hyperlink"/>
+                <w:noProof/>
+              </w:rPr>
+              <w:t>Inleiding</w:t>
+            </w:r>
+            <w:r>
+              <w:rPr>
+                <w:noProof/>
+                <w:webHidden/>
+              </w:rPr>
+              <w:tab/>
+            </w:r>
+            <w:r>
+              <w:rPr>
+                <w:noProof/>
+                <w:webHidden/>
+              </w:rPr>
+              <w:fldChar w:fldCharType="begin"/>
+            </w:r>
+            <w:r>
+              <w:rPr>
+                <w:noProof/>
+                <w:webHidden/>
+              </w:rPr>
+              <w:instrText xml:space="preserve"> PAGEREF _Toc227086851 \h </w:instrText>
+            </w:r>
+            <w:r>
+              <w:rPr>
+                <w:noProof/>
+                <w:webHidden/>
+              </w:rPr>
+            </w:r>
+            <w:r>
+              <w:rPr>
+                <w:noProof/>
+                <w:webHidden/>
+              </w:rPr>
+              <w:fldChar w:fldCharType="separate"/>
+            </w:r>
+            <w:r>
+              <w:rPr>
+                <w:noProof/>
+                <w:webHidden/>
+              </w:rPr>
+              <w:t>2</w:t>
+            </w:r>
+            <w:r>
+              <w:rPr>
+                <w:noProof/>
+                <w:webHidden/>
+              </w:rPr>
+              <w:fldChar w:fldCharType="end"/>
+            </w:r>
+          </w:hyperlink>
+        </w:p>
+        <w:p>
+          <w:pPr>
+            <w:pStyle w:val="Inhopg1"/>
+            <w:tabs>
+              <w:tab w:val="right" w:leader="dot" w:pos="9016"/>
+            </w:tabs>
+            <w:rPr>
+              <w:rFonts w:eastAsiaTheme="minorEastAsia"/>
+              <w:noProof/>
+              <w:sz w:val="24"/>
+              <w:szCs w:val="24"/>
+              <w:lang w:val="nl-NL" w:eastAsia="nl-NL"/>
+            </w:rPr>
+          </w:pPr>
+          <w:hyperlink w:anchor="_Toc227086852" w:history="1">
+            <w:r>
+              <w:rPr>
+                <w:rStyle w:val="Hyperlink"/>
                 <w:noProof/>
                 <w:lang w:val="nl-NL"/>
               </w:rPr>
-              <w:t>Geen inhoudsopgavegegevens gevonden.</w:t>
+              <w:t>Hoe maak je een API</w:t>
             </w:r>
-          </w:fldSimple>
+            <w:r>
+              <w:rPr>
+                <w:noProof/>
+                <w:webHidden/>
+              </w:rPr>
+              <w:tab/>
+            </w:r>
+            <w:r>
+              <w:rPr>
+                <w:noProof/>
+                <w:webHidden/>
+              </w:rPr>
+              <w:fldChar w:fldCharType="begin"/>
+            </w:r>
+            <w:r>
+              <w:rPr>
+                <w:noProof/>
+                <w:webHidden/>
+              </w:rPr>
+              <w:instrText xml:space="preserve"> PAGEREF _Toc227086852 \h </w:instrText>
+            </w:r>
+            <w:r>
+              <w:rPr>
+                <w:noProof/>
+                <w:webHidden/>
+              </w:rPr>
+            </w:r>
+            <w:r>
+              <w:rPr>
+                <w:noProof/>
+                <w:webHidden/>
+              </w:rPr>
+              <w:fldChar w:fldCharType="separate"/>
+            </w:r>
+            <w:r>
+              <w:rPr>
+                <w:noProof/>
+                <w:webHidden/>
+              </w:rPr>
+              <w:t>3</w:t>
+            </w:r>
+            <w:r>
+              <w:rPr>
+                <w:noProof/>
+                <w:webHidden/>
+              </w:rPr>
+              <w:fldChar w:fldCharType="end"/>
+            </w:r>
+          </w:hyperlink>
+        </w:p>
+        <w:p>
+          <w:r>
+            <w:rPr>
+              <w:b/>
+              <w:bCs/>
+              <w:noProof/>
+              <w:lang w:val="nl-NL"/>
+            </w:rPr>
+            <w:fldChar w:fldCharType="end"/>
+          </w:r>
         </w:p>
       </w:sdtContent>
     </w:sdt>
@@ -623,10 +774,12 @@
       <w:pPr>
         <w:pStyle w:val="Kop1"/>
       </w:pPr>
+      <w:bookmarkStart w:id="0" w:name="_Toc227086851"/>
       <w:r>
         <w:lastRenderedPageBreak/>
         <w:t>Inleiding</w:t>
       </w:r>
+      <w:bookmarkEnd w:id="0"/>
     </w:p>
     <w:p>
       <w:pPr>
@@ -663,7 +816,19 @@
         <w:rPr>
           <w:lang w:val="nl-NL"/>
         </w:rPr>
-        <w:t>een API gaan toepassen binnen het project van een reserveringssysteem  voor het klusbedrijf</w:t>
+        <w:t xml:space="preserve">een API gaan toepassen binnen het project van een </w:t>
+      </w:r>
+      <w:r>
+        <w:rPr>
+          <w:lang w:val="nl-NL"/>
+        </w:rPr>
+        <w:t>reserveringssysteem voor</w:t>
+      </w:r>
+      <w:r>
+        <w:rPr>
+          <w:lang w:val="nl-NL"/>
+        </w:rPr>
+        <w:t xml:space="preserve"> het klusbedrijf</w:t>
       </w:r>
       <w:r>
         <w:rPr>
@@ -692,6 +857,7 @@
           <w:lang w:val="nl-NL"/>
         </w:rPr>
       </w:pPr>
+      <w:bookmarkStart w:id="1" w:name="_Toc227086852"/>
       <w:r>
         <w:rPr>
           <w:lang w:val="nl-NL"/>
@@ -699,6 +865,7 @@
         <w:lastRenderedPageBreak/>
         <w:t>Hoe maak je een API</w:t>
       </w:r>
+      <w:bookmarkEnd w:id="1"/>
     </w:p>
     <w:p>
       <w:pPr>
@@ -719,11 +886,47 @@
           <w:lang w:val="nl-NL"/>
         </w:rPr>
       </w:pPr>
-      <w:r>
-        <w:rPr>
-          <w:lang w:val="nl-NL"/>
-        </w:rPr>
-        <w:t xml:space="preserve">Tjdens het onderzoeken zag ik heel vaak een module genaamd Flask. Met Flask kan je aangeven welke functies er moeten worden aangeroepen bij een bepaalde </w:t>
+      <w:proofErr w:type="spellStart"/>
+      <w:r>
+        <w:rPr>
+          <w:lang w:val="nl-NL"/>
+        </w:rPr>
+        <w:t>Tjdens</w:t>
+      </w:r>
+      <w:proofErr w:type="spellEnd"/>
+      <w:r>
+        <w:rPr>
+          <w:lang w:val="nl-NL"/>
+        </w:rPr>
+        <w:t xml:space="preserve"> het onderzoeken zag ik heel vaak een module genaamd </w:t>
+      </w:r>
+      <w:proofErr w:type="spellStart"/>
+      <w:r>
+        <w:rPr>
+          <w:lang w:val="nl-NL"/>
+        </w:rPr>
+        <w:t>Flask</w:t>
+      </w:r>
+      <w:proofErr w:type="spellEnd"/>
+      <w:r>
+        <w:rPr>
+          <w:lang w:val="nl-NL"/>
+        </w:rPr>
+        <w:t xml:space="preserve">. Met </w:t>
+      </w:r>
+      <w:proofErr w:type="spellStart"/>
+      <w:r>
+        <w:rPr>
+          <w:lang w:val="nl-NL"/>
+        </w:rPr>
+        <w:t>Flask</w:t>
+      </w:r>
+      <w:proofErr w:type="spellEnd"/>
+      <w:r>
+        <w:rPr>
+          <w:lang w:val="nl-NL"/>
+        </w:rPr>
+        <w:t xml:space="preserve"> kan je aangeven welke functies er moeten worden aangeroepen bij een bepaalde </w:t>
       </w:r>
       <w:r>
         <w:rPr>
@@ -746,6 +949,7 @@
       </w:r>
       <w:r>
         <w:rPr>
+          <w:noProof/>
           <w:lang w:val="nl-NL"/>
         </w:rPr>
         <w:drawing>
@@ -795,7 +999,21 @@
         <w:rPr>
           <w:lang w:val="nl-NL"/>
         </w:rPr>
-        <w:t>Met @app.route kan ik aangeven op welke pagina de functie moet worden aangeroepen.</w:t>
+        <w:t>Met @</w:t>
+      </w:r>
+      <w:proofErr w:type="gramStart"/>
+      <w:r>
+        <w:rPr>
+          <w:lang w:val="nl-NL"/>
+        </w:rPr>
+        <w:t>app.route</w:t>
+      </w:r>
+      <w:proofErr w:type="gramEnd"/>
+      <w:r>
+        <w:rPr>
+          <w:lang w:val="nl-NL"/>
+        </w:rPr>
+        <w:t xml:space="preserve"> kan ik aangeven op welke pagina de functie moet worden aangeroepen.</w:t>
       </w:r>
     </w:p>
     <w:p>
@@ -808,13 +1026,41 @@
         <w:rPr>
           <w:lang w:val="nl-NL"/>
         </w:rPr>
-        <w:t>Bij methods is te zien dat ik POST  aangeef. POST zorgt ervoor dat de gegevens die worden ingevuld</w:t>
-      </w:r>
-      <w:r>
-        <w:rPr>
-          <w:lang w:val="nl-NL"/>
-        </w:rPr>
-        <w:t xml:space="preserve"> dan worden gestuurd naar de backend. Bij mij is dit een SQL database.</w:t>
+        <w:t xml:space="preserve">Bij </w:t>
+      </w:r>
+      <w:proofErr w:type="spellStart"/>
+      <w:r>
+        <w:rPr>
+          <w:lang w:val="nl-NL"/>
+        </w:rPr>
+        <w:t>methods</w:t>
+      </w:r>
+      <w:proofErr w:type="spellEnd"/>
+      <w:r>
+        <w:rPr>
+          <w:lang w:val="nl-NL"/>
+        </w:rPr>
+        <w:t xml:space="preserve"> is te zien dat ik POST  aangeef. POST zorgt ervoor dat de gegevens die worden ingevuld</w:t>
+      </w:r>
+      <w:r>
+        <w:rPr>
+          <w:lang w:val="nl-NL"/>
+        </w:rPr>
+        <w:t xml:space="preserve"> dan worden gestuurd naar de backend. Bij mij is dit een </w:t>
+      </w:r>
+      <w:proofErr w:type="gramStart"/>
+      <w:r>
+        <w:rPr>
+          <w:lang w:val="nl-NL"/>
+        </w:rPr>
+        <w:t>SQL database</w:t>
+      </w:r>
+      <w:proofErr w:type="gramEnd"/>
+      <w:r>
+        <w:rPr>
+          <w:lang w:val="nl-NL"/>
+        </w:rPr>
+        <w:t>.</w:t>
       </w:r>
     </w:p>
     <w:p>
@@ -827,7 +1073,23 @@
         <w:rPr>
           <w:lang w:val="nl-NL"/>
         </w:rPr>
-        <w:t xml:space="preserve">Ik geef een variabel aan genaamd resultaat. Dus alle gegevens die worden ingevuld(request.form) </w:t>
+        <w:t>Ik geef een variabel aan genaamd resultaat. Dus alle gegevens die worden ingevuld(</w:t>
+      </w:r>
+      <w:proofErr w:type="spellStart"/>
+      <w:proofErr w:type="gramStart"/>
+      <w:r>
+        <w:rPr>
+          <w:lang w:val="nl-NL"/>
+        </w:rPr>
+        <w:t>request.form</w:t>
+      </w:r>
+      <w:proofErr w:type="spellEnd"/>
+      <w:proofErr w:type="gramEnd"/>
+      <w:r>
+        <w:rPr>
+          <w:lang w:val="nl-NL"/>
+        </w:rPr>
+        <w:t xml:space="preserve">) </w:t>
       </w:r>
       <w:r>
         <w:rPr>
@@ -846,7 +1108,21 @@
         <w:rPr>
           <w:lang w:val="nl-NL"/>
         </w:rPr>
-        <w:t xml:space="preserve">Voor elke value die in de query komen </w:t>
+        <w:t xml:space="preserve">Voor elke </w:t>
+      </w:r>
+      <w:proofErr w:type="spellStart"/>
+      <w:r>
+        <w:rPr>
+          <w:lang w:val="nl-NL"/>
+        </w:rPr>
+        <w:t>value</w:t>
+      </w:r>
+      <w:proofErr w:type="spellEnd"/>
+      <w:r>
+        <w:rPr>
+          <w:lang w:val="nl-NL"/>
+        </w:rPr>
+        <w:t xml:space="preserve"> die in de query komen </w:t>
       </w:r>
       <w:r>
         <w:rPr>
@@ -896,7 +1172,21 @@
         <w:rPr>
           <w:lang w:val="nl-NL"/>
         </w:rPr>
-        <w:t xml:space="preserve"> de functie/api werkt. Ik heb een simpel html pagina gemaakt met daarin de gevraagde velden</w:t>
+        <w:t xml:space="preserve"> de functie/</w:t>
+      </w:r>
+      <w:proofErr w:type="spellStart"/>
+      <w:r>
+        <w:rPr>
+          <w:lang w:val="nl-NL"/>
+        </w:rPr>
+        <w:t>api</w:t>
+      </w:r>
+      <w:proofErr w:type="spellEnd"/>
+      <w:r>
+        <w:rPr>
+          <w:lang w:val="nl-NL"/>
+        </w:rPr>
+        <w:t xml:space="preserve"> werkt. Ik heb een simpel html pagina gemaakt met daarin de gevraagde velden</w:t>
       </w:r>
     </w:p>
     <w:p>
@@ -907,6 +1197,7 @@
       </w:pPr>
       <w:r>
         <w:rPr>
+          <w:noProof/>
           <w:lang w:val="nl-NL"/>
         </w:rPr>
         <w:drawing>
@@ -962,7 +1253,21 @@
         <w:rPr>
           <w:lang w:val="nl-NL"/>
         </w:rPr>
-        <w:t>in het netwerktijdlijn dat de API wordt aangeroepen</w:t>
+        <w:t xml:space="preserve">in </w:t>
+      </w:r>
+      <w:proofErr w:type="gramStart"/>
+      <w:r>
+        <w:rPr>
+          <w:lang w:val="nl-NL"/>
+        </w:rPr>
+        <w:t>het netwerktijdlijn</w:t>
+      </w:r>
+      <w:proofErr w:type="gramEnd"/>
+      <w:r>
+        <w:rPr>
+          <w:lang w:val="nl-NL"/>
+        </w:rPr>
+        <w:t xml:space="preserve"> dat de API wordt aangeroepen</w:t>
       </w:r>
       <w:r>
         <w:rPr>
@@ -974,19 +1279,103 @@
         <w:rPr>
           <w:lang w:val="nl-NL"/>
         </w:rPr>
-        <w:t xml:space="preserve"> Na het submitten kreeg ik te zien dat er een pagina genaamd medewerker aangeroepen wordt. Deze bestaat alleen niet. </w:t>
-      </w:r>
-      <w:r>
-        <w:rPr>
-          <w:lang w:val="nl-NL"/>
-        </w:rPr>
-        <w:t>Dit kwam door een fout binnen de HTML code. Deze gaf aan dat de request naar een pagina genaamd</w:t>
-      </w:r>
-      <w:r>
-        <w:rPr>
-          <w:lang w:val="nl-NL"/>
-        </w:rPr>
-        <w:t xml:space="preserve"> medewerkers. Nadat ik dit had verwijderd binnen de HTML code kreeg ik nogsteeds een foutcode. Ditmaal omdat er werdt gevraagd naar een </w:t>
+        <w:t xml:space="preserve"> Na het </w:t>
+      </w:r>
+      <w:proofErr w:type="spellStart"/>
+      <w:r>
+        <w:rPr>
+          <w:lang w:val="nl-NL"/>
+        </w:rPr>
+        <w:t>submitten</w:t>
+      </w:r>
+      <w:proofErr w:type="spellEnd"/>
+      <w:r>
+        <w:rPr>
+          <w:lang w:val="nl-NL"/>
+        </w:rPr>
+        <w:t xml:space="preserve"> kreeg ik te zien dat er een pagina genaamd medewerker aangeroepen wordt. Deze bestaat alleen niet. </w:t>
+      </w:r>
+      <w:r>
+        <w:rPr>
+          <w:lang w:val="nl-NL"/>
+        </w:rPr>
+        <w:t xml:space="preserve">Dit kwam door een fout binnen de </w:t>
+      </w:r>
+      <w:proofErr w:type="gramStart"/>
+      <w:r>
+        <w:rPr>
+          <w:lang w:val="nl-NL"/>
+        </w:rPr>
+        <w:t>HTML code</w:t>
+      </w:r>
+      <w:proofErr w:type="gramEnd"/>
+      <w:r>
+        <w:rPr>
+          <w:lang w:val="nl-NL"/>
+        </w:rPr>
+        <w:t xml:space="preserve">. Deze gaf aan dat de </w:t>
+      </w:r>
+      <w:proofErr w:type="spellStart"/>
+      <w:r>
+        <w:rPr>
+          <w:lang w:val="nl-NL"/>
+        </w:rPr>
+        <w:t>request</w:t>
+      </w:r>
+      <w:proofErr w:type="spellEnd"/>
+      <w:r>
+        <w:rPr>
+          <w:lang w:val="nl-NL"/>
+        </w:rPr>
+        <w:t xml:space="preserve"> naar een pagina genaamd</w:t>
+      </w:r>
+      <w:r>
+        <w:rPr>
+          <w:lang w:val="nl-NL"/>
+        </w:rPr>
+        <w:t xml:space="preserve"> medewerkers. Nadat ik dit had verwijderd binnen de </w:t>
+      </w:r>
+      <w:proofErr w:type="gramStart"/>
+      <w:r>
+        <w:rPr>
+          <w:lang w:val="nl-NL"/>
+        </w:rPr>
+        <w:t>HTML code</w:t>
+      </w:r>
+      <w:proofErr w:type="gramEnd"/>
+      <w:r>
+        <w:rPr>
+          <w:lang w:val="nl-NL"/>
+        </w:rPr>
+        <w:t xml:space="preserve"> kreeg ik </w:t>
+      </w:r>
+      <w:proofErr w:type="spellStart"/>
+      <w:r>
+        <w:rPr>
+          <w:lang w:val="nl-NL"/>
+        </w:rPr>
+        <w:t>nogsteeds</w:t>
+      </w:r>
+      <w:proofErr w:type="spellEnd"/>
+      <w:r>
+        <w:rPr>
+          <w:lang w:val="nl-NL"/>
+        </w:rPr>
+        <w:t xml:space="preserve"> een foutcode. Ditmaal omdat er </w:t>
+      </w:r>
+      <w:proofErr w:type="spellStart"/>
+      <w:r>
+        <w:rPr>
+          <w:lang w:val="nl-NL"/>
+        </w:rPr>
+        <w:t>werdt</w:t>
+      </w:r>
+      <w:proofErr w:type="spellEnd"/>
+      <w:r>
+        <w:rPr>
+          <w:lang w:val="nl-NL"/>
+        </w:rPr>
+        <w:t xml:space="preserve"> gevraagd naar een </w:t>
       </w:r>
       <w:r>
         <w:rPr>
@@ -999,7 +1388,49 @@
         <w:rPr>
           <w:lang w:val="nl-NL"/>
         </w:rPr>
-        <w:t>. Toen ik in plaats van localhost aanpastte naar / dus de root file, kreeg ik ander resultaat.</w:t>
+        <w:t xml:space="preserve">. Toen ik in plaats van </w:t>
+      </w:r>
+      <w:proofErr w:type="spellStart"/>
+      <w:r>
+        <w:rPr>
+          <w:lang w:val="nl-NL"/>
+        </w:rPr>
+        <w:t>localhost</w:t>
+      </w:r>
+      <w:proofErr w:type="spellEnd"/>
+      <w:r>
+        <w:rPr>
+          <w:lang w:val="nl-NL"/>
+        </w:rPr>
+        <w:t xml:space="preserve"> </w:t>
+      </w:r>
+      <w:proofErr w:type="spellStart"/>
+      <w:r>
+        <w:rPr>
+          <w:lang w:val="nl-NL"/>
+        </w:rPr>
+        <w:t>aanpastte</w:t>
+      </w:r>
+      <w:proofErr w:type="spellEnd"/>
+      <w:r>
+        <w:rPr>
+          <w:lang w:val="nl-NL"/>
+        </w:rPr>
+        <w:t xml:space="preserve"> </w:t>
+      </w:r>
+      <w:proofErr w:type="gramStart"/>
+      <w:r>
+        <w:rPr>
+          <w:lang w:val="nl-NL"/>
+        </w:rPr>
+        <w:t>naar /</w:t>
+      </w:r>
+      <w:proofErr w:type="gramEnd"/>
+      <w:r>
+        <w:rPr>
+          <w:lang w:val="nl-NL"/>
+        </w:rPr>
+        <w:t xml:space="preserve"> dus de root file, kreeg ik ander resultaat.</w:t>
       </w:r>
     </w:p>
     <w:p>
@@ -1010,6 +1441,7 @@
       </w:pPr>
       <w:r>
         <w:rPr>
+          <w:noProof/>
           <w:lang w:val="nl-NL"/>
         </w:rPr>
         <w:drawing>
@@ -1059,13 +1491,759 @@
         <w:rPr>
           <w:lang w:val="nl-NL"/>
         </w:rPr>
-        <w:t xml:space="preserve">Dit leek al beter. Ik zie in het netwerktijdlijn geen </w:t>
+        <w:t xml:space="preserve">Dit leek al beter. Ik zie in </w:t>
+      </w:r>
+      <w:proofErr w:type="gramStart"/>
+      <w:r>
+        <w:rPr>
+          <w:lang w:val="nl-NL"/>
+        </w:rPr>
+        <w:t>het netwerktijdlijn</w:t>
+      </w:r>
+      <w:proofErr w:type="gramEnd"/>
+      <w:r>
+        <w:rPr>
+          <w:lang w:val="nl-NL"/>
+        </w:rPr>
+        <w:t xml:space="preserve"> geen </w:t>
       </w:r>
       <w:r>
         <w:rPr>
           <w:lang w:val="nl-NL"/>
         </w:rPr>
         <w:t>foute bestanden.</w:t>
+      </w:r>
+    </w:p>
+    <w:p>
+      <w:pPr>
+        <w:rPr>
+          <w:lang w:val="nl-NL"/>
+        </w:rPr>
+      </w:pPr>
+      <w:r>
+        <w:rPr>
+          <w:lang w:val="nl-NL"/>
+        </w:rPr>
+        <w:t xml:space="preserve">Toen ik ging controleren of er data </w:t>
+      </w:r>
+      <w:proofErr w:type="gramStart"/>
+      <w:r>
+        <w:rPr>
+          <w:lang w:val="nl-NL"/>
+        </w:rPr>
+        <w:t>stond</w:t>
+      </w:r>
+      <w:proofErr w:type="gramEnd"/>
+      <w:r>
+        <w:rPr>
+          <w:lang w:val="nl-NL"/>
+        </w:rPr>
+        <w:t xml:space="preserve"> in de database zag ik niks staan. Na wat onderzoek zag ik het volgende staan in de </w:t>
+      </w:r>
+      <w:proofErr w:type="gramStart"/>
+      <w:r>
+        <w:rPr>
+          <w:lang w:val="nl-NL"/>
+        </w:rPr>
+        <w:t>HTML code</w:t>
+      </w:r>
+      <w:proofErr w:type="gramEnd"/>
+    </w:p>
+    <w:p>
+      <w:pPr>
+        <w:rPr>
+          <w:lang w:val="nl-NL"/>
+        </w:rPr>
+      </w:pPr>
+      <w:r>
+        <w:rPr>
+          <w:lang w:val="nl-NL"/>
+        </w:rPr>
+        <w:drawing>
+          <wp:inline distT="0" distB="0" distL="0" distR="0" wp14:anchorId="4AF499F4" wp14:editId="24C30C98">
+            <wp:extent cx="2505425" cy="247685"/>
+            <wp:effectExtent l="0" t="0" r="0" b="0"/>
+            <wp:docPr id="104474185" name="Afbeelding 1"/>
+            <wp:cNvGraphicFramePr>
+              <a:graphicFrameLocks xmlns:a="http://schemas.openxmlformats.org/drawingml/2006/main" noChangeAspect="1"/>
+            </wp:cNvGraphicFramePr>
+            <a:graphic xmlns:a="http://schemas.openxmlformats.org/drawingml/2006/main">
+              <a:graphicData uri="http://schemas.openxmlformats.org/drawingml/2006/picture">
+                <pic:pic xmlns:pic="http://schemas.openxmlformats.org/drawingml/2006/picture">
+                  <pic:nvPicPr>
+                    <pic:cNvPr id="104474185" name=""/>
+                    <pic:cNvPicPr/>
+                  </pic:nvPicPr>
+                  <pic:blipFill>
+                    <a:blip r:embed="rId9"/>
+                    <a:stretch>
+                      <a:fillRect/>
+                    </a:stretch>
+                  </pic:blipFill>
+                  <pic:spPr>
+                    <a:xfrm>
+                      <a:off x="0" y="0"/>
+                      <a:ext cx="2505425" cy="247685"/>
+                    </a:xfrm>
+                    <a:prstGeom prst="rect">
+                      <a:avLst/>
+                    </a:prstGeom>
+                  </pic:spPr>
+                </pic:pic>
+              </a:graphicData>
+            </a:graphic>
+          </wp:inline>
+        </w:drawing>
+      </w:r>
+    </w:p>
+    <w:p>
+      <w:pPr>
+        <w:rPr>
+          <w:lang w:val="nl-NL"/>
+        </w:rPr>
+      </w:pPr>
+      <w:r>
+        <w:rPr>
+          <w:lang w:val="nl-NL"/>
+        </w:rPr>
+        <w:t xml:space="preserve">Op dit moment wordt er een post gedaan naar de root van de bestanden. Er wordt niks gestuurd naar de </w:t>
+      </w:r>
+      <w:proofErr w:type="gramStart"/>
+      <w:r>
+        <w:rPr>
+          <w:lang w:val="nl-NL"/>
+        </w:rPr>
+        <w:t>API route</w:t>
+      </w:r>
+      <w:proofErr w:type="gramEnd"/>
+      <w:r>
+        <w:rPr>
+          <w:lang w:val="nl-NL"/>
+        </w:rPr>
+        <w:t xml:space="preserve">. Ik moet ervoor zorgen dat de form wordt gestuurd naar de API. Om dit te doen moet ik ten eerste de </w:t>
+      </w:r>
+      <w:r>
+        <w:rPr>
+          <w:lang w:val="nl-NL"/>
+        </w:rPr>
+        <w:t xml:space="preserve">python code starten. Daarna gaat </w:t>
+      </w:r>
+      <w:proofErr w:type="spellStart"/>
+      <w:r>
+        <w:rPr>
+          <w:lang w:val="nl-NL"/>
+        </w:rPr>
+        <w:t>Flask</w:t>
+      </w:r>
+      <w:proofErr w:type="spellEnd"/>
+      <w:r>
+        <w:rPr>
+          <w:lang w:val="nl-NL"/>
+        </w:rPr>
+        <w:t xml:space="preserve"> pas luisteren naar de aangegeven route</w:t>
+      </w:r>
+    </w:p>
+    <w:p>
+      <w:pPr>
+        <w:rPr>
+          <w:lang w:val="nl-NL"/>
+        </w:rPr>
+      </w:pPr>
+      <w:r>
+        <w:rPr>
+          <w:lang w:val="nl-NL"/>
+        </w:rPr>
+        <w:drawing>
+          <wp:inline distT="0" distB="0" distL="0" distR="0" wp14:anchorId="47444281" wp14:editId="1419ACDD">
+            <wp:extent cx="5731510" cy="1038225"/>
+            <wp:effectExtent l="0" t="0" r="2540" b="9525"/>
+            <wp:docPr id="367683525" name="Afbeelding 1"/>
+            <wp:cNvGraphicFramePr>
+              <a:graphicFrameLocks xmlns:a="http://schemas.openxmlformats.org/drawingml/2006/main" noChangeAspect="1"/>
+            </wp:cNvGraphicFramePr>
+            <a:graphic xmlns:a="http://schemas.openxmlformats.org/drawingml/2006/main">
+              <a:graphicData uri="http://schemas.openxmlformats.org/drawingml/2006/picture">
+                <pic:pic xmlns:pic="http://schemas.openxmlformats.org/drawingml/2006/picture">
+                  <pic:nvPicPr>
+                    <pic:cNvPr id="367683525" name=""/>
+                    <pic:cNvPicPr/>
+                  </pic:nvPicPr>
+                  <pic:blipFill>
+                    <a:blip r:embed="rId10"/>
+                    <a:stretch>
+                      <a:fillRect/>
+                    </a:stretch>
+                  </pic:blipFill>
+                  <pic:spPr>
+                    <a:xfrm>
+                      <a:off x="0" y="0"/>
+                      <a:ext cx="5731510" cy="1038225"/>
+                    </a:xfrm>
+                    <a:prstGeom prst="rect">
+                      <a:avLst/>
+                    </a:prstGeom>
+                  </pic:spPr>
+                </pic:pic>
+              </a:graphicData>
+            </a:graphic>
+          </wp:inline>
+        </w:drawing>
+      </w:r>
+    </w:p>
+    <w:p>
+      <w:pPr>
+        <w:rPr>
+          <w:lang w:val="nl-NL"/>
+        </w:rPr>
+      </w:pPr>
+      <w:r>
+        <w:rPr>
+          <w:lang w:val="nl-NL"/>
+        </w:rPr>
+        <w:t xml:space="preserve">Hier zie ik </w:t>
+      </w:r>
+      <w:r>
+        <w:rPr>
+          <w:lang w:val="nl-NL"/>
+        </w:rPr>
+        <w:t xml:space="preserve">dat de </w:t>
+      </w:r>
+      <w:r>
+        <w:rPr>
+          <w:lang w:val="nl-NL"/>
+        </w:rPr>
+        <w:t xml:space="preserve">API gaat luisteren op 127.0.0.1:5000. Ik moet in de </w:t>
+      </w:r>
+      <w:proofErr w:type="gramStart"/>
+      <w:r>
+        <w:rPr>
+          <w:lang w:val="nl-NL"/>
+        </w:rPr>
+        <w:t>HTML code</w:t>
+      </w:r>
+      <w:proofErr w:type="gramEnd"/>
+      <w:r>
+        <w:rPr>
+          <w:lang w:val="nl-NL"/>
+        </w:rPr>
+        <w:t xml:space="preserve"> aangeven dat daar de form naar gestuurd moet worden.</w:t>
+      </w:r>
+    </w:p>
+    <w:p>
+      <w:pPr>
+        <w:rPr>
+          <w:lang w:val="nl-NL"/>
+        </w:rPr>
+      </w:pPr>
+      <w:r>
+        <w:rPr>
+          <w:lang w:val="nl-NL"/>
+        </w:rPr>
+        <w:t>Wanneer ik nu opnieuw een form invul, krijg ik het volgende te zien</w:t>
+      </w:r>
+      <w:r>
+        <w:rPr>
+          <w:lang w:val="nl-NL"/>
+        </w:rPr>
+        <w:drawing>
+          <wp:inline distT="0" distB="0" distL="0" distR="0" wp14:anchorId="65037D3F" wp14:editId="72261A1C">
+            <wp:extent cx="5731510" cy="2471420"/>
+            <wp:effectExtent l="0" t="0" r="2540" b="5080"/>
+            <wp:docPr id="2030555740" name="Afbeelding 1"/>
+            <wp:cNvGraphicFramePr>
+              <a:graphicFrameLocks xmlns:a="http://schemas.openxmlformats.org/drawingml/2006/main" noChangeAspect="1"/>
+            </wp:cNvGraphicFramePr>
+            <a:graphic xmlns:a="http://schemas.openxmlformats.org/drawingml/2006/main">
+              <a:graphicData uri="http://schemas.openxmlformats.org/drawingml/2006/picture">
+                <pic:pic xmlns:pic="http://schemas.openxmlformats.org/drawingml/2006/picture">
+                  <pic:nvPicPr>
+                    <pic:cNvPr id="2030555740" name=""/>
+                    <pic:cNvPicPr/>
+                  </pic:nvPicPr>
+                  <pic:blipFill>
+                    <a:blip r:embed="rId11"/>
+                    <a:stretch>
+                      <a:fillRect/>
+                    </a:stretch>
+                  </pic:blipFill>
+                  <pic:spPr>
+                    <a:xfrm>
+                      <a:off x="0" y="0"/>
+                      <a:ext cx="5731510" cy="2471420"/>
+                    </a:xfrm>
+                    <a:prstGeom prst="rect">
+                      <a:avLst/>
+                    </a:prstGeom>
+                  </pic:spPr>
+                </pic:pic>
+              </a:graphicData>
+            </a:graphic>
+          </wp:inline>
+        </w:drawing>
+      </w:r>
+    </w:p>
+    <w:p>
+      <w:pPr>
+        <w:rPr>
+          <w:lang w:val="nl-NL"/>
+        </w:rPr>
+      </w:pPr>
+      <w:r>
+        <w:rPr>
+          <w:lang w:val="nl-NL"/>
+        </w:rPr>
+        <w:lastRenderedPageBreak/>
+        <w:t xml:space="preserve">Het lukt op dit moment dus nog steeds niet om de form te versturen. Na het analyseren van de foutcode valt mij het volgende op: </w:t>
+      </w:r>
+      <w:r>
+        <w:rPr>
+          <w:lang w:val="nl-NL"/>
+        </w:rPr>
+        <w:t xml:space="preserve">“400 Bad </w:t>
+      </w:r>
+      <w:proofErr w:type="spellStart"/>
+      <w:r>
+        <w:rPr>
+          <w:lang w:val="nl-NL"/>
+        </w:rPr>
+        <w:t>Request</w:t>
+      </w:r>
+      <w:proofErr w:type="spellEnd"/>
+      <w:r>
+        <w:rPr>
+          <w:lang w:val="nl-NL"/>
+        </w:rPr>
+        <w:t xml:space="preserve">: The </w:t>
+      </w:r>
+      <w:proofErr w:type="gramStart"/>
+      <w:r>
+        <w:rPr>
+          <w:lang w:val="nl-NL"/>
+        </w:rPr>
+        <w:t>browser(</w:t>
+      </w:r>
+      <w:proofErr w:type="gramEnd"/>
+      <w:r>
+        <w:rPr>
+          <w:lang w:val="nl-NL"/>
+        </w:rPr>
+        <w:t xml:space="preserve">or proxy) sent a </w:t>
+      </w:r>
+      <w:proofErr w:type="spellStart"/>
+      <w:r>
+        <w:rPr>
+          <w:lang w:val="nl-NL"/>
+        </w:rPr>
+        <w:t>request</w:t>
+      </w:r>
+      <w:proofErr w:type="spellEnd"/>
+      <w:r>
+        <w:rPr>
+          <w:lang w:val="nl-NL"/>
+        </w:rPr>
+        <w:t xml:space="preserve"> </w:t>
+      </w:r>
+      <w:proofErr w:type="spellStart"/>
+      <w:r>
+        <w:rPr>
+          <w:lang w:val="nl-NL"/>
+        </w:rPr>
+        <w:t>that</w:t>
+      </w:r>
+      <w:proofErr w:type="spellEnd"/>
+      <w:r>
+        <w:rPr>
+          <w:lang w:val="nl-NL"/>
+        </w:rPr>
+        <w:t xml:space="preserve"> </w:t>
+      </w:r>
+      <w:proofErr w:type="spellStart"/>
+      <w:r>
+        <w:rPr>
+          <w:lang w:val="nl-NL"/>
+        </w:rPr>
+        <w:t>this</w:t>
+      </w:r>
+      <w:proofErr w:type="spellEnd"/>
+      <w:r>
+        <w:rPr>
+          <w:lang w:val="nl-NL"/>
+        </w:rPr>
+        <w:t xml:space="preserve"> server </w:t>
+      </w:r>
+      <w:proofErr w:type="spellStart"/>
+      <w:r>
+        <w:rPr>
+          <w:lang w:val="nl-NL"/>
+        </w:rPr>
+        <w:t>could</w:t>
+      </w:r>
+      <w:proofErr w:type="spellEnd"/>
+      <w:r>
+        <w:rPr>
+          <w:lang w:val="nl-NL"/>
+        </w:rPr>
+        <w:t xml:space="preserve"> </w:t>
+      </w:r>
+      <w:proofErr w:type="spellStart"/>
+      <w:r>
+        <w:rPr>
+          <w:lang w:val="nl-NL"/>
+        </w:rPr>
+        <w:t>not</w:t>
+      </w:r>
+      <w:proofErr w:type="spellEnd"/>
+      <w:r>
+        <w:rPr>
+          <w:lang w:val="nl-NL"/>
+        </w:rPr>
+        <w:t xml:space="preserve"> </w:t>
+      </w:r>
+      <w:proofErr w:type="spellStart"/>
+      <w:r>
+        <w:rPr>
+          <w:lang w:val="nl-NL"/>
+        </w:rPr>
+        <w:t>understand</w:t>
+      </w:r>
+      <w:proofErr w:type="spellEnd"/>
+      <w:r>
+        <w:rPr>
+          <w:lang w:val="nl-NL"/>
+        </w:rPr>
+        <w:t xml:space="preserve">. </w:t>
+      </w:r>
+      <w:proofErr w:type="spellStart"/>
+      <w:r>
+        <w:rPr>
+          <w:lang w:val="nl-NL"/>
+        </w:rPr>
+        <w:t>KeyError</w:t>
+      </w:r>
+      <w:proofErr w:type="spellEnd"/>
+      <w:r>
+        <w:rPr>
+          <w:lang w:val="nl-NL"/>
+        </w:rPr>
+        <w:t>: ‘achternaam’”.</w:t>
+      </w:r>
+    </w:p>
+    <w:p>
+      <w:pPr>
+        <w:rPr>
+          <w:lang w:val="nl-NL"/>
+        </w:rPr>
+      </w:pPr>
+      <w:r>
+        <w:rPr>
+          <w:lang w:val="nl-NL"/>
+        </w:rPr>
+        <w:t>Na het zien van de error ging ik vergelijken wat de API verwacht en wat de HTML verstuurd.</w:t>
+      </w:r>
+    </w:p>
+    <w:p>
+      <w:pPr>
+        <w:rPr>
+          <w:lang w:val="nl-NL"/>
+        </w:rPr>
+      </w:pPr>
+      <w:r>
+        <w:rPr>
+          <w:lang w:val="nl-NL"/>
+        </w:rPr>
+        <w:drawing>
+          <wp:inline distT="0" distB="0" distL="0" distR="0" wp14:anchorId="280E9432" wp14:editId="52580081">
+            <wp:extent cx="5087060" cy="819264"/>
+            <wp:effectExtent l="0" t="0" r="0" b="0"/>
+            <wp:docPr id="1733954462" name="Afbeelding 1"/>
+            <wp:cNvGraphicFramePr>
+              <a:graphicFrameLocks xmlns:a="http://schemas.openxmlformats.org/drawingml/2006/main" noChangeAspect="1"/>
+            </wp:cNvGraphicFramePr>
+            <a:graphic xmlns:a="http://schemas.openxmlformats.org/drawingml/2006/main">
+              <a:graphicData uri="http://schemas.openxmlformats.org/drawingml/2006/picture">
+                <pic:pic xmlns:pic="http://schemas.openxmlformats.org/drawingml/2006/picture">
+                  <pic:nvPicPr>
+                    <pic:cNvPr id="1733954462" name=""/>
+                    <pic:cNvPicPr/>
+                  </pic:nvPicPr>
+                  <pic:blipFill>
+                    <a:blip r:embed="rId12"/>
+                    <a:stretch>
+                      <a:fillRect/>
+                    </a:stretch>
+                  </pic:blipFill>
+                  <pic:spPr>
+                    <a:xfrm>
+                      <a:off x="0" y="0"/>
+                      <a:ext cx="5087060" cy="819264"/>
+                    </a:xfrm>
+                    <a:prstGeom prst="rect">
+                      <a:avLst/>
+                    </a:prstGeom>
+                  </pic:spPr>
+                </pic:pic>
+              </a:graphicData>
+            </a:graphic>
+          </wp:inline>
+        </w:drawing>
+      </w:r>
+    </w:p>
+    <w:p>
+      <w:pPr>
+        <w:rPr>
+          <w:i/>
+          <w:iCs/>
+          <w:lang w:val="nl-NL"/>
+        </w:rPr>
+      </w:pPr>
+      <w:r>
+        <w:rPr>
+          <w:i/>
+          <w:iCs/>
+          <w:lang w:val="nl-NL"/>
+        </w:rPr>
+        <w:t>HTML-pagina</w:t>
+      </w:r>
+    </w:p>
+    <w:p>
+      <w:pPr>
+        <w:rPr>
+          <w:i/>
+          <w:iCs/>
+          <w:lang w:val="nl-NL"/>
+        </w:rPr>
+      </w:pPr>
+      <w:r>
+        <w:rPr>
+          <w:i/>
+          <w:iCs/>
+          <w:lang w:val="nl-NL"/>
+        </w:rPr>
+        <w:drawing>
+          <wp:inline distT="0" distB="0" distL="0" distR="0" wp14:anchorId="66571FA6" wp14:editId="376602B0">
+            <wp:extent cx="5268060" cy="1819529"/>
+            <wp:effectExtent l="0" t="0" r="8890" b="9525"/>
+            <wp:docPr id="38783987" name="Afbeelding 1"/>
+            <wp:cNvGraphicFramePr>
+              <a:graphicFrameLocks xmlns:a="http://schemas.openxmlformats.org/drawingml/2006/main" noChangeAspect="1"/>
+            </wp:cNvGraphicFramePr>
+            <a:graphic xmlns:a="http://schemas.openxmlformats.org/drawingml/2006/main">
+              <a:graphicData uri="http://schemas.openxmlformats.org/drawingml/2006/picture">
+                <pic:pic xmlns:pic="http://schemas.openxmlformats.org/drawingml/2006/picture">
+                  <pic:nvPicPr>
+                    <pic:cNvPr id="38783987" name=""/>
+                    <pic:cNvPicPr/>
+                  </pic:nvPicPr>
+                  <pic:blipFill>
+                    <a:blip r:embed="rId13"/>
+                    <a:stretch>
+                      <a:fillRect/>
+                    </a:stretch>
+                  </pic:blipFill>
+                  <pic:spPr>
+                    <a:xfrm>
+                      <a:off x="0" y="0"/>
+                      <a:ext cx="5268060" cy="1819529"/>
+                    </a:xfrm>
+                    <a:prstGeom prst="rect">
+                      <a:avLst/>
+                    </a:prstGeom>
+                  </pic:spPr>
+                </pic:pic>
+              </a:graphicData>
+            </a:graphic>
+          </wp:inline>
+        </w:drawing>
+      </w:r>
+    </w:p>
+    <w:p>
+      <w:pPr>
+        <w:rPr>
+          <w:i/>
+          <w:iCs/>
+          <w:lang w:val="nl-NL"/>
+        </w:rPr>
+      </w:pPr>
+      <w:r>
+        <w:rPr>
+          <w:i/>
+          <w:iCs/>
+          <w:lang w:val="nl-NL"/>
+        </w:rPr>
+        <w:t>API-route</w:t>
+      </w:r>
+    </w:p>
+    <w:p>
+      <w:pPr>
+        <w:rPr>
+          <w:lang w:val="nl-NL"/>
+        </w:rPr>
+      </w:pPr>
+      <w:r>
+        <w:rPr>
+          <w:lang w:val="nl-NL"/>
+        </w:rPr>
+        <w:t>Het enige verschil wat ik zie is dat bij de HTML-pagina een hoofdletter staat bij Achternaam en bij de API-route staat het allemaal in kleine letters.</w:t>
+      </w:r>
+    </w:p>
+    <w:p>
+      <w:pPr>
+        <w:rPr>
+          <w:lang w:val="nl-NL"/>
+        </w:rPr>
+      </w:pPr>
+      <w:r>
+        <w:rPr>
+          <w:lang w:val="nl-NL"/>
+        </w:rPr>
+        <w:t xml:space="preserve">Toen ik deze had aangepast en opnieuw een POST uitvoerde, kreeg ik het volgende resultaat </w:t>
+      </w:r>
+      <w:r>
+        <w:rPr>
+          <w:lang w:val="nl-NL"/>
+        </w:rPr>
+        <w:drawing>
+          <wp:inline distT="0" distB="0" distL="0" distR="0" wp14:anchorId="5DF7722B" wp14:editId="78E3CC16">
+            <wp:extent cx="3410426" cy="1124107"/>
+            <wp:effectExtent l="0" t="0" r="0" b="0"/>
+            <wp:docPr id="1204705912" name="Afbeelding 1"/>
+            <wp:cNvGraphicFramePr>
+              <a:graphicFrameLocks xmlns:a="http://schemas.openxmlformats.org/drawingml/2006/main" noChangeAspect="1"/>
+            </wp:cNvGraphicFramePr>
+            <a:graphic xmlns:a="http://schemas.openxmlformats.org/drawingml/2006/main">
+              <a:graphicData uri="http://schemas.openxmlformats.org/drawingml/2006/picture">
+                <pic:pic xmlns:pic="http://schemas.openxmlformats.org/drawingml/2006/picture">
+                  <pic:nvPicPr>
+                    <pic:cNvPr id="1204705912" name=""/>
+                    <pic:cNvPicPr/>
+                  </pic:nvPicPr>
+                  <pic:blipFill>
+                    <a:blip r:embed="rId14"/>
+                    <a:stretch>
+                      <a:fillRect/>
+                    </a:stretch>
+                  </pic:blipFill>
+                  <pic:spPr>
+                    <a:xfrm>
+                      <a:off x="0" y="0"/>
+                      <a:ext cx="3410426" cy="1124107"/>
+                    </a:xfrm>
+                    <a:prstGeom prst="rect">
+                      <a:avLst/>
+                    </a:prstGeom>
+                  </pic:spPr>
+                </pic:pic>
+              </a:graphicData>
+            </a:graphic>
+          </wp:inline>
+        </w:drawing>
+      </w:r>
+    </w:p>
+    <w:p>
+      <w:pPr>
+        <w:rPr>
+          <w:lang w:val="nl-NL"/>
+        </w:rPr>
+      </w:pPr>
+      <w:r>
+        <w:rPr>
+          <w:lang w:val="nl-NL"/>
+        </w:rPr>
+        <w:drawing>
+          <wp:inline distT="0" distB="0" distL="0" distR="0" wp14:anchorId="3E518659" wp14:editId="589BD687">
+            <wp:extent cx="4182059" cy="314369"/>
+            <wp:effectExtent l="0" t="0" r="0" b="9525"/>
+            <wp:docPr id="201839065" name="Afbeelding 1"/>
+            <wp:cNvGraphicFramePr>
+              <a:graphicFrameLocks xmlns:a="http://schemas.openxmlformats.org/drawingml/2006/main" noChangeAspect="1"/>
+            </wp:cNvGraphicFramePr>
+            <a:graphic xmlns:a="http://schemas.openxmlformats.org/drawingml/2006/main">
+              <a:graphicData uri="http://schemas.openxmlformats.org/drawingml/2006/picture">
+                <pic:pic xmlns:pic="http://schemas.openxmlformats.org/drawingml/2006/picture">
+                  <pic:nvPicPr>
+                    <pic:cNvPr id="201839065" name=""/>
+                    <pic:cNvPicPr/>
+                  </pic:nvPicPr>
+                  <pic:blipFill>
+                    <a:blip r:embed="rId15"/>
+                    <a:stretch>
+                      <a:fillRect/>
+                    </a:stretch>
+                  </pic:blipFill>
+                  <pic:spPr>
+                    <a:xfrm>
+                      <a:off x="0" y="0"/>
+                      <a:ext cx="4182059" cy="314369"/>
+                    </a:xfrm>
+                    <a:prstGeom prst="rect">
+                      <a:avLst/>
+                    </a:prstGeom>
+                  </pic:spPr>
+                </pic:pic>
+              </a:graphicData>
+            </a:graphic>
+          </wp:inline>
+        </w:drawing>
+      </w:r>
+    </w:p>
+    <w:p>
+      <w:pPr>
+        <w:rPr>
+          <w:lang w:val="nl-NL"/>
+        </w:rPr>
+      </w:pPr>
+      <w:r>
+        <w:rPr>
+          <w:lang w:val="nl-NL"/>
+        </w:rPr>
+        <w:drawing>
+          <wp:inline distT="0" distB="0" distL="0" distR="0" wp14:anchorId="1710CFC4" wp14:editId="381C000D">
+            <wp:extent cx="5731510" cy="209550"/>
+            <wp:effectExtent l="0" t="0" r="2540" b="0"/>
+            <wp:docPr id="880142014" name="Afbeelding 1"/>
+            <wp:cNvGraphicFramePr>
+              <a:graphicFrameLocks xmlns:a="http://schemas.openxmlformats.org/drawingml/2006/main" noChangeAspect="1"/>
+            </wp:cNvGraphicFramePr>
+            <a:graphic xmlns:a="http://schemas.openxmlformats.org/drawingml/2006/main">
+              <a:graphicData uri="http://schemas.openxmlformats.org/drawingml/2006/picture">
+                <pic:pic xmlns:pic="http://schemas.openxmlformats.org/drawingml/2006/picture">
+                  <pic:nvPicPr>
+                    <pic:cNvPr id="880142014" name=""/>
+                    <pic:cNvPicPr/>
+                  </pic:nvPicPr>
+                  <pic:blipFill>
+                    <a:blip r:embed="rId16"/>
+                    <a:stretch>
+                      <a:fillRect/>
+                    </a:stretch>
+                  </pic:blipFill>
+                  <pic:spPr>
+                    <a:xfrm>
+                      <a:off x="0" y="0"/>
+                      <a:ext cx="5731510" cy="209550"/>
+                    </a:xfrm>
+                    <a:prstGeom prst="rect">
+                      <a:avLst/>
+                    </a:prstGeom>
+                  </pic:spPr>
+                </pic:pic>
+              </a:graphicData>
+            </a:graphic>
+          </wp:inline>
+        </w:drawing>
+      </w:r>
+    </w:p>
+    <w:p>
+      <w:pPr>
+        <w:rPr>
+          <w:lang w:val="nl-NL"/>
+        </w:rPr>
+      </w:pPr>
+      <w:r>
+        <w:rPr>
+          <w:lang w:val="nl-NL"/>
+        </w:rPr>
+        <w:t>Na dat ik deze resultaten kreeg, wist ik dat het gelukt is om een API POST route aan te maken</w:t>
       </w:r>
     </w:p>
     <w:sectPr>
@@ -1089,7 +2267,7 @@
         <w:kern w:val="2"/>
         <w:sz w:val="22"/>
         <w:szCs w:val="22"/>
-        <w:lang w:val="en-NL" w:eastAsia="en-US" w:bidi="ar-SA"/>
+        <w:lang w:eastAsia="en-US" w:bidi="ar-SA"/>
         <w14:ligatures w14:val="standardContextual"/>
       </w:rPr>
     </w:rPrDefault>
@@ -2009,7 +3187,7 @@
     <w:rPr>
       <w:rFonts w:eastAsiaTheme="minorEastAsia"/>
       <w:kern w:val="0"/>
-      <w:lang w:eastAsia="en-NL"/>
+      <w:lang/>
       <w14:ligatures w14:val="none"/>
     </w:rPr>
   </w:style>
@@ -2022,7 +3200,7 @@
     <w:rPr>
       <w:rFonts w:eastAsiaTheme="minorEastAsia"/>
       <w:kern w:val="0"/>
-      <w:lang w:eastAsia="en-NL"/>
+      <w:lang/>
       <w14:ligatures w14:val="none"/>
     </w:rPr>
   </w:style>
@@ -2042,8 +3220,31 @@
       <w:kern w:val="0"/>
       <w:sz w:val="32"/>
       <w:szCs w:val="32"/>
-      <w:lang w:eastAsia="en-NL"/>
+      <w:lang/>
       <w14:ligatures w14:val="none"/>
+    </w:rPr>
+  </w:style>
+  <w:style w:type="paragraph" w:styleId="Inhopg1">
+    <w:name w:val="toc 1"/>
+    <w:basedOn w:val="Standaard"/>
+    <w:next w:val="Standaard"/>
+    <w:autoRedefine/>
+    <w:uiPriority w:val="39"/>
+    <w:unhideWhenUsed/>
+    <w:rsid w:val="006C2DEA"/>
+    <w:pPr>
+      <w:spacing w:after="100"/>
+    </w:pPr>
+  </w:style>
+  <w:style w:type="character" w:styleId="Hyperlink">
+    <w:name w:val="Hyperlink"/>
+    <w:basedOn w:val="Standaardalinea-lettertype"/>
+    <w:uiPriority w:val="99"/>
+    <w:unhideWhenUsed/>
+    <w:rsid w:val="006C2DEA"/>
+    <w:rPr>
+      <w:color w:val="0563C1" w:themeColor="hyperlink"/>
+      <w:u w:val="single"/>
     </w:rPr>
   </w:style>
 </w:styles>

</xml_diff>